<commit_message>
Add transformations and create etl flowchart
</commit_message>
<xml_diff>
--- a/3.Transformations to the DB data using PBID.docx
+++ b/3.Transformations to the DB data using PBID.docx
@@ -4,76 +4,500 @@
   <w:body>
     <w:p>
       <w:r>
-        <w:t>We will pull the data from MySQL DB into our Power BI Desktop and perform different transformations to clean and format the data properly.</w:t>
-      </w:r>
-    </w:p>
-    <w:p>
-      <w:r>
-        <w:t>We will do ETL – Extract Transform and Load</w:t>
-      </w:r>
-    </w:p>
-    <w:p>
-      <w:r>
-        <w:t>1</w:t>
-      </w:r>
-      <w:r>
-        <w:rPr>
-          <w:vertAlign w:val="superscript"/>
-        </w:rPr>
-        <w:t>st</w:t>
-      </w:r>
-      <w:r>
-        <w:t xml:space="preserve"> step is to install Power BI Desktop in your device</w:t>
-      </w:r>
-    </w:p>
-    <w:p>
-      <w:r>
-        <w:t>2</w:t>
-      </w:r>
-      <w:r>
-        <w:rPr>
-          <w:vertAlign w:val="superscript"/>
-        </w:rPr>
-        <w:t>nd</w:t>
-      </w:r>
-      <w:r>
-        <w:t xml:space="preserve"> step is import data into PBID using get data</w:t>
-      </w:r>
-    </w:p>
-    <w:p>
-      <w:r>
-        <w:tab/>
-        <w:t>Click on get data -&gt; More -&gt; Database -&gt; MySQL Database -&gt; Connect(might ask to install MySQL connector) -&gt; Insert Server and Database details(server: localhost for local servers) -&gt; OK</w:t>
-      </w:r>
-    </w:p>
-    <w:p>
-      <w:r>
-        <w:t>3</w:t>
-      </w:r>
-      <w:r>
-        <w:rPr>
-          <w:vertAlign w:val="superscript"/>
-        </w:rPr>
-        <w:t>rd</w:t>
-      </w:r>
-      <w:r>
-        <w:t xml:space="preserve"> step is ETL/transformation of data</w:t>
-      </w:r>
-    </w:p>
-    <w:p>
-      <w:r>
-        <w:t>4</w:t>
-      </w:r>
-      <w:r>
-        <w:rPr>
-          <w:vertAlign w:val="superscript"/>
-        </w:rPr>
-        <w:t>th</w:t>
-      </w:r>
-      <w:r>
-        <w:t xml:space="preserve"> step is to build data model</w:t>
-      </w:r>
-    </w:p>
+        <w:rPr>
+          <w:rFonts w:ascii="Segoe UI Emoji" w:hAnsi="Segoe UI Emoji" w:cs="Segoe UI Emoji"/>
+          <w:b/>
+          <w:bCs/>
+        </w:rPr>
+        <w:t>🧩</w:t>
+      </w:r>
+      <w:r>
+        <w:rPr>
+          <w:b/>
+          <w:bCs/>
+        </w:rPr>
+        <w:t xml:space="preserve"> Power BI ETL Workflow: From MySQL to Insight</w:t>
+      </w:r>
+    </w:p>
+    <w:p>
+      <w:r>
+        <w:t>This guide outlines the complete ETL (Extract, Transform, Load) process for building a Power BI report using data from a MySQL database.</w:t>
+      </w:r>
+    </w:p>
+    <w:p>
+      <w:r>
+        <w:pict w14:anchorId="254D048C">
+          <v:rect id="_x0000_i1068" style="width:0;height:1.5pt" o:hralign="center" o:hrstd="t" o:hr="t" fillcolor="#a0a0a0" stroked="f"/>
+        </w:pict>
+      </w:r>
+    </w:p>
+    <w:p>
+      <w:pPr>
+        <w:rPr>
+          <w:b/>
+          <w:bCs/>
+        </w:rPr>
+      </w:pPr>
+      <w:r>
+        <w:rPr>
+          <w:rFonts w:ascii="Segoe UI Emoji" w:hAnsi="Segoe UI Emoji" w:cs="Segoe UI Emoji"/>
+          <w:b/>
+          <w:bCs/>
+        </w:rPr>
+        <w:t>🔌</w:t>
+      </w:r>
+      <w:r>
+        <w:rPr>
+          <w:b/>
+          <w:bCs/>
+        </w:rPr>
+        <w:t xml:space="preserve"> Step 1: Install Power BI Desktop</w:t>
+      </w:r>
+    </w:p>
+    <w:p>
+      <w:r>
+        <w:t xml:space="preserve">Ensure Power BI Desktop is installed on your device to begin the data </w:t>
+      </w:r>
+      <w:r>
+        <w:t>modelling</w:t>
+      </w:r>
+      <w:r>
+        <w:t xml:space="preserve"> and visualization process.</w:t>
+      </w:r>
+    </w:p>
+    <w:p>
+      <w:r>
+        <w:pict w14:anchorId="16B433DD">
+          <v:rect id="_x0000_i1069" style="width:0;height:1.5pt" o:hralign="center" o:hrstd="t" o:hr="t" fillcolor="#a0a0a0" stroked="f"/>
+        </w:pict>
+      </w:r>
+    </w:p>
+    <w:p>
+      <w:pPr>
+        <w:rPr>
+          <w:b/>
+          <w:bCs/>
+        </w:rPr>
+      </w:pPr>
+      <w:r>
+        <w:rPr>
+          <w:rFonts w:ascii="Segoe UI Emoji" w:hAnsi="Segoe UI Emoji" w:cs="Segoe UI Emoji"/>
+          <w:b/>
+          <w:bCs/>
+        </w:rPr>
+        <w:t>📥</w:t>
+      </w:r>
+      <w:r>
+        <w:rPr>
+          <w:b/>
+          <w:bCs/>
+        </w:rPr>
+        <w:t xml:space="preserve"> Step 2: Connect to MySQL Database</w:t>
+      </w:r>
+    </w:p>
+    <w:p>
+      <w:r>
+        <w:t xml:space="preserve">Use Power BI’s </w:t>
+      </w:r>
+      <w:r>
+        <w:rPr>
+          <w:b/>
+          <w:bCs/>
+        </w:rPr>
+        <w:t>Get Data</w:t>
+      </w:r>
+      <w:r>
+        <w:t xml:space="preserve"> feature to import data:</w:t>
+      </w:r>
+    </w:p>
+    <w:p>
+      <w:pPr>
+        <w:numPr>
+          <w:ilvl w:val="0"/>
+          <w:numId w:val="3"/>
+        </w:numPr>
+      </w:pPr>
+      <w:r>
+        <w:t>Navigate to: Home → Get Data → More → Database → MySQL Database → Connect</w:t>
+      </w:r>
+    </w:p>
+    <w:p>
+      <w:pPr>
+        <w:numPr>
+          <w:ilvl w:val="0"/>
+          <w:numId w:val="3"/>
+        </w:numPr>
+      </w:pPr>
+      <w:r>
+        <w:t>If prompted, install the MySQL connector.</w:t>
+      </w:r>
+    </w:p>
+    <w:p>
+      <w:pPr>
+        <w:numPr>
+          <w:ilvl w:val="0"/>
+          <w:numId w:val="3"/>
+        </w:numPr>
+      </w:pPr>
+      <w:r>
+        <w:t>Enter server and database details (e.g., localhost for local servers).</w:t>
+      </w:r>
+    </w:p>
+    <w:p>
+      <w:pPr>
+        <w:numPr>
+          <w:ilvl w:val="0"/>
+          <w:numId w:val="3"/>
+        </w:numPr>
+      </w:pPr>
+      <w:r>
+        <w:t xml:space="preserve">Select relevant tables and choose </w:t>
+      </w:r>
+      <w:r>
+        <w:rPr>
+          <w:b/>
+          <w:bCs/>
+        </w:rPr>
+        <w:t>Load</w:t>
+      </w:r>
+      <w:r>
+        <w:t xml:space="preserve"> or </w:t>
+      </w:r>
+      <w:r>
+        <w:rPr>
+          <w:b/>
+          <w:bCs/>
+        </w:rPr>
+        <w:t>Transform</w:t>
+      </w:r>
+      <w:r>
+        <w:t>.</w:t>
+      </w:r>
+    </w:p>
+    <w:p>
+      <w:r>
+        <w:pict w14:anchorId="1A3654AE">
+          <v:rect id="_x0000_i1070" style="width:0;height:1.5pt" o:hralign="center" o:hrstd="t" o:hr="t" fillcolor="#a0a0a0" stroked="f"/>
+        </w:pict>
+      </w:r>
+    </w:p>
+    <w:p>
+      <w:pPr>
+        <w:rPr>
+          <w:b/>
+          <w:bCs/>
+        </w:rPr>
+      </w:pPr>
+      <w:r>
+        <w:rPr>
+          <w:rFonts w:ascii="Segoe UI Emoji" w:hAnsi="Segoe UI Emoji" w:cs="Segoe UI Emoji"/>
+          <w:b/>
+          <w:bCs/>
+        </w:rPr>
+        <w:t>🧠</w:t>
+      </w:r>
+      <w:r>
+        <w:rPr>
+          <w:b/>
+          <w:bCs/>
+        </w:rPr>
+        <w:t xml:space="preserve"> Step 3: Build the Data Model</w:t>
+      </w:r>
+    </w:p>
+    <w:p>
+      <w:r>
+        <w:t xml:space="preserve">In </w:t>
+      </w:r>
+      <w:r>
+        <w:rPr>
+          <w:b/>
+          <w:bCs/>
+        </w:rPr>
+        <w:t>Model View</w:t>
+      </w:r>
+      <w:r>
+        <w:t>:</w:t>
+      </w:r>
+    </w:p>
+    <w:p>
+      <w:pPr>
+        <w:numPr>
+          <w:ilvl w:val="0"/>
+          <w:numId w:val="4"/>
+        </w:numPr>
+      </w:pPr>
+      <w:r>
+        <w:t>Connect dimension tables (e.g., Market, Product, Zone) to the fact table (Transactions) using common keys.</w:t>
+      </w:r>
+    </w:p>
+    <w:p>
+      <w:pPr>
+        <w:numPr>
+          <w:ilvl w:val="0"/>
+          <w:numId w:val="4"/>
+        </w:numPr>
+      </w:pPr>
+      <w:r>
+        <w:t xml:space="preserve">Design a </w:t>
+      </w:r>
+      <w:r>
+        <w:rPr>
+          <w:b/>
+          <w:bCs/>
+        </w:rPr>
+        <w:t>Star Schema</w:t>
+      </w:r>
+      <w:r>
+        <w:t xml:space="preserve"> for optimal performance and clarity.</w:t>
+      </w:r>
+    </w:p>
+    <w:p>
+      <w:r>
+        <w:pict w14:anchorId="315B5990">
+          <v:rect id="_x0000_i1071" style="width:0;height:1.5pt" o:hralign="center" o:hrstd="t" o:hr="t" fillcolor="#a0a0a0" stroked="f"/>
+        </w:pict>
+      </w:r>
+    </w:p>
+    <w:p>
+      <w:pPr>
+        <w:rPr>
+          <w:b/>
+          <w:bCs/>
+        </w:rPr>
+      </w:pPr>
+      <w:r>
+        <w:rPr>
+          <w:rFonts w:ascii="Segoe UI Emoji" w:hAnsi="Segoe UI Emoji" w:cs="Segoe UI Emoji"/>
+          <w:b/>
+          <w:bCs/>
+        </w:rPr>
+        <w:t>🧹</w:t>
+      </w:r>
+      <w:r>
+        <w:rPr>
+          <w:b/>
+          <w:bCs/>
+        </w:rPr>
+        <w:t xml:space="preserve"> Step 4: Transform the Data (Power Query Editor)</w:t>
+      </w:r>
+    </w:p>
+    <w:p>
+      <w:r>
+        <w:t>Apply the following transformations to clean and standardize the dataset:</w:t>
+      </w:r>
+    </w:p>
+    <w:p>
+      <w:pPr>
+        <w:numPr>
+          <w:ilvl w:val="0"/>
+          <w:numId w:val="5"/>
+        </w:numPr>
+      </w:pPr>
+      <w:r>
+        <w:rPr>
+          <w:b/>
+          <w:bCs/>
+        </w:rPr>
+        <w:t>Filter Markets</w:t>
+      </w:r>
+      <w:r>
+        <w:t>: Remove non-Indian markets from the Market table.</w:t>
+      </w:r>
+    </w:p>
+    <w:p>
+      <w:pPr>
+        <w:numPr>
+          <w:ilvl w:val="0"/>
+          <w:numId w:val="5"/>
+        </w:numPr>
+      </w:pPr>
+      <w:r>
+        <w:rPr>
+          <w:b/>
+          <w:bCs/>
+        </w:rPr>
+        <w:t>Clean Transactions</w:t>
+      </w:r>
+      <w:r>
+        <w:t xml:space="preserve">: </w:t>
+      </w:r>
+    </w:p>
+    <w:p>
+      <w:pPr>
+        <w:numPr>
+          <w:ilvl w:val="1"/>
+          <w:numId w:val="5"/>
+        </w:numPr>
+      </w:pPr>
+      <w:r>
+        <w:t>Remove rows where sales_amount is less than or equal to 0.</w:t>
+      </w:r>
+      <w:r>
+        <w:br/>
+      </w:r>
+      <w:r>
+        <w:rPr>
+          <w:i/>
+          <w:iCs/>
+        </w:rPr>
+        <w:t>SQL Check</w:t>
+      </w:r>
+      <w:r>
+        <w:t xml:space="preserve">: </w:t>
+      </w:r>
+    </w:p>
+    <w:p>
+      <w:pPr>
+        <w:numPr>
+          <w:ilvl w:val="1"/>
+          <w:numId w:val="5"/>
+        </w:numPr>
+      </w:pPr>
+      <w:r>
+        <w:t xml:space="preserve">SELECT </w:t>
+      </w:r>
+      <w:proofErr w:type="gramStart"/>
+      <w:r>
+        <w:t>COUNT(</w:t>
+      </w:r>
+      <w:proofErr w:type="gramEnd"/>
+      <w:r>
+        <w:t xml:space="preserve">*) FROM </w:t>
+      </w:r>
+      <w:proofErr w:type="gramStart"/>
+      <w:r>
+        <w:t>sales.transactions</w:t>
+      </w:r>
+      <w:proofErr w:type="gramEnd"/>
+      <w:r>
+        <w:t xml:space="preserve"> WHERE sales_amount &lt;= 0;</w:t>
+      </w:r>
+    </w:p>
+    <w:p>
+      <w:pPr>
+        <w:numPr>
+          <w:ilvl w:val="1"/>
+          <w:numId w:val="5"/>
+        </w:numPr>
+      </w:pPr>
+      <w:r>
+        <w:t>-- Output: 1611 rows</w:t>
+      </w:r>
+    </w:p>
+    <w:p>
+      <w:pPr>
+        <w:numPr>
+          <w:ilvl w:val="1"/>
+          <w:numId w:val="5"/>
+        </w:numPr>
+      </w:pPr>
+      <w:r>
+        <w:t xml:space="preserve">Add a new column sales_amount_INR to normalize currency: </w:t>
+      </w:r>
+    </w:p>
+    <w:p>
+      <w:pPr>
+        <w:numPr>
+          <w:ilvl w:val="1"/>
+          <w:numId w:val="5"/>
+        </w:numPr>
+      </w:pPr>
+      <w:r>
+        <w:t>= Table.AddColumn(#"Filtered Rows", "sales_amount_INR", each if [currency] = "USD" then [sales_amount] * 87.66 else [sales_amount])</w:t>
+      </w:r>
+    </w:p>
+    <w:p>
+      <w:r>
+        <w:rPr>
+          <w:i/>
+          <w:iCs/>
+        </w:rPr>
+        <w:lastRenderedPageBreak/>
+        <w:t>Note: 1 USD = ₹87.66 as of August 8, 2025</w:t>
+      </w:r>
+    </w:p>
+    <w:p>
+      <w:pPr>
+        <w:numPr>
+          <w:ilvl w:val="0"/>
+          <w:numId w:val="5"/>
+        </w:numPr>
+      </w:pPr>
+      <w:r>
+        <w:rPr>
+          <w:b/>
+          <w:bCs/>
+        </w:rPr>
+        <w:t>Replace Columns</w:t>
+      </w:r>
+      <w:r>
+        <w:t>: Optionally remove or replace outdated columns with transformed versions.</w:t>
+      </w:r>
+    </w:p>
+    <w:p>
+      <w:r>
+        <w:pict w14:anchorId="1887A9F1">
+          <v:rect id="_x0000_i1072" style="width:0;height:1.5pt" o:hralign="center" o:hrstd="t" o:hr="t" fillcolor="#a0a0a0" stroked="f"/>
+        </w:pict>
+      </w:r>
+    </w:p>
+    <w:p>
+      <w:pPr>
+        <w:rPr>
+          <w:b/>
+          <w:bCs/>
+        </w:rPr>
+      </w:pPr>
+      <w:r>
+        <w:rPr>
+          <w:rFonts w:ascii="Segoe UI Emoji" w:hAnsi="Segoe UI Emoji" w:cs="Segoe UI Emoji"/>
+          <w:b/>
+          <w:bCs/>
+        </w:rPr>
+        <w:t>✅</w:t>
+      </w:r>
+      <w:r>
+        <w:rPr>
+          <w:b/>
+          <w:bCs/>
+        </w:rPr>
+        <w:t xml:space="preserve"> Step 5: Apply Changes</w:t>
+      </w:r>
+    </w:p>
+    <w:p>
+      <w:r>
+        <w:t>Once all transformations are complete:</w:t>
+      </w:r>
+    </w:p>
+    <w:p>
+      <w:pPr>
+        <w:numPr>
+          <w:ilvl w:val="0"/>
+          <w:numId w:val="6"/>
+        </w:numPr>
+      </w:pPr>
+      <w:r>
+        <w:t xml:space="preserve">Click </w:t>
+      </w:r>
+      <w:r>
+        <w:rPr>
+          <w:b/>
+          <w:bCs/>
+        </w:rPr>
+        <w:t>Close &amp; Apply</w:t>
+      </w:r>
+      <w:r>
+        <w:t xml:space="preserve"> to load the cleaned data into Power BI for reporting.</w:t>
+      </w:r>
+    </w:p>
+    <w:p>
+      <w:r>
+        <w:pict w14:anchorId="278F3C5C">
+          <v:rect id="_x0000_i1073" style="width:0;height:1.5pt" o:hralign="center" o:hrstd="t" o:hr="t" fillcolor="#a0a0a0" stroked="f"/>
+        </w:pict>
+      </w:r>
+    </w:p>
+    <w:p/>
     <w:sectPr>
       <w:pgSz w:w="11906" w:h="16838"/>
       <w:pgMar w:top="1440" w:right="1440" w:bottom="1440" w:left="1440" w:header="708" w:footer="708" w:gutter="0"/>
@@ -82,6 +506,851 @@
     </w:sectPr>
   </w:body>
 </w:document>
+</file>
+
+<file path=word/numbering.xml><?xml version="1.0" encoding="utf-8"?>
+<w:numbering xmlns:wpc="http://schemas.microsoft.com/office/word/2010/wordprocessingCanvas" xmlns:cx="http://schemas.microsoft.com/office/drawing/2014/chartex" xmlns:cx1="http://schemas.microsoft.com/office/drawing/2015/9/8/chartex" xmlns:cx2="http://schemas.microsoft.com/office/drawing/2015/10/21/chartex" xmlns:cx3="http://schemas.microsoft.com/office/drawing/2016/5/9/chartex" xmlns:cx4="http://schemas.microsoft.com/office/drawing/2016/5/10/chartex" xmlns:cx5="http://schemas.microsoft.com/office/drawing/2016/5/11/chartex" xmlns:cx6="http://schemas.microsoft.com/office/drawing/2016/5/12/chartex" xmlns:cx7="http://schemas.microsoft.com/office/drawing/2016/5/13/chartex" xmlns:cx8="http://schemas.microsoft.com/office/drawing/2016/5/14/chartex" xmlns:mc="http://schemas.openxmlformats.org/markup-compatibility/2006" xmlns:aink="http://schemas.microsoft.com/office/drawing/2016/ink" xmlns:am3d="http://schemas.microsoft.com/office/drawing/2017/model3d" xmlns:o="urn:schemas-microsoft-com:office:office" xmlns:oel="http://schemas.microsoft.com/office/2019/extlst" xmlns:r="http://schemas.openxmlformats.org/officeDocument/2006/relationships" xmlns:m="http://schemas.openxmlformats.org/officeDocument/2006/math" xmlns:v="urn:schemas-microsoft-com:vml" xmlns:wp14="http://schemas.microsoft.com/office/word/2010/wordprocessingDrawing" xmlns:wp="http://schemas.openxmlformats.org/drawingml/2006/wordprocessingDrawing" xmlns:w10="urn:schemas-microsoft-com:office:word" xmlns:w="http://schemas.openxmlformats.org/wordprocessingml/2006/main" xmlns:w14="http://schemas.microsoft.com/office/word/2010/wordml" xmlns:w15="http://schemas.microsoft.com/office/word/2012/wordml" xmlns:w16cex="http://schemas.microsoft.com/office/word/2018/wordml/cex" xmlns:w16cid="http://schemas.microsoft.com/office/word/2016/wordml/cid" xmlns:w16="http://schemas.microsoft.com/office/word/2018/wordml" xmlns:w16du="http://schemas.microsoft.com/office/word/2023/wordml/word16du" xmlns:w16sdtdh="http://schemas.microsoft.com/office/word/2020/wordml/sdtdatahash" xmlns:w16sdtfl="http://schemas.microsoft.com/office/word/2024/wordml/sdtformatlock" xmlns:w16se="http://schemas.microsoft.com/office/word/2015/wordml/symex" xmlns:wpg="http://schemas.microsoft.com/office/word/2010/wordprocessingGroup" xmlns:wpi="http://schemas.microsoft.com/office/word/2010/wordprocessingInk" xmlns:wne="http://schemas.microsoft.com/office/word/2006/wordml" xmlns:wps="http://schemas.microsoft.com/office/word/2010/wordprocessingShape" mc:Ignorable="w14 w15 w16se w16cid w16 w16cex w16sdtdh w16sdtfl w16du wp14">
+  <w:abstractNum w:abstractNumId="0" w15:restartNumberingAfterBreak="0">
+    <w:nsid w:val="052B7815"/>
+    <w:multiLevelType w:val="multilevel"/>
+    <w:tmpl w:val="3F96F056"/>
+    <w:lvl w:ilvl="0">
+      <w:start w:val="1"/>
+      <w:numFmt w:val="bullet"/>
+      <w:lvlText w:val=""/>
+      <w:lvlJc w:val="left"/>
+      <w:pPr>
+        <w:tabs>
+          <w:tab w:val="num" w:pos="720"/>
+        </w:tabs>
+        <w:ind w:left="720" w:hanging="360"/>
+      </w:pPr>
+      <w:rPr>
+        <w:rFonts w:ascii="Symbol" w:hAnsi="Symbol" w:hint="default"/>
+        <w:sz w:val="20"/>
+      </w:rPr>
+    </w:lvl>
+    <w:lvl w:ilvl="1">
+      <w:start w:val="1"/>
+      <w:numFmt w:val="bullet"/>
+      <w:lvlText w:val="o"/>
+      <w:lvlJc w:val="left"/>
+      <w:pPr>
+        <w:tabs>
+          <w:tab w:val="num" w:pos="1440"/>
+        </w:tabs>
+        <w:ind w:left="1440" w:hanging="360"/>
+      </w:pPr>
+      <w:rPr>
+        <w:rFonts w:ascii="Courier New" w:hAnsi="Courier New" w:hint="default"/>
+        <w:sz w:val="20"/>
+      </w:rPr>
+    </w:lvl>
+    <w:lvl w:ilvl="2" w:tentative="1">
+      <w:start w:val="1"/>
+      <w:numFmt w:val="bullet"/>
+      <w:lvlText w:val=""/>
+      <w:lvlJc w:val="left"/>
+      <w:pPr>
+        <w:tabs>
+          <w:tab w:val="num" w:pos="2160"/>
+        </w:tabs>
+        <w:ind w:left="2160" w:hanging="360"/>
+      </w:pPr>
+      <w:rPr>
+        <w:rFonts w:ascii="Wingdings" w:hAnsi="Wingdings" w:hint="default"/>
+        <w:sz w:val="20"/>
+      </w:rPr>
+    </w:lvl>
+    <w:lvl w:ilvl="3" w:tentative="1">
+      <w:start w:val="1"/>
+      <w:numFmt w:val="bullet"/>
+      <w:lvlText w:val=""/>
+      <w:lvlJc w:val="left"/>
+      <w:pPr>
+        <w:tabs>
+          <w:tab w:val="num" w:pos="2880"/>
+        </w:tabs>
+        <w:ind w:left="2880" w:hanging="360"/>
+      </w:pPr>
+      <w:rPr>
+        <w:rFonts w:ascii="Wingdings" w:hAnsi="Wingdings" w:hint="default"/>
+        <w:sz w:val="20"/>
+      </w:rPr>
+    </w:lvl>
+    <w:lvl w:ilvl="4" w:tentative="1">
+      <w:start w:val="1"/>
+      <w:numFmt w:val="bullet"/>
+      <w:lvlText w:val=""/>
+      <w:lvlJc w:val="left"/>
+      <w:pPr>
+        <w:tabs>
+          <w:tab w:val="num" w:pos="3600"/>
+        </w:tabs>
+        <w:ind w:left="3600" w:hanging="360"/>
+      </w:pPr>
+      <w:rPr>
+        <w:rFonts w:ascii="Wingdings" w:hAnsi="Wingdings" w:hint="default"/>
+        <w:sz w:val="20"/>
+      </w:rPr>
+    </w:lvl>
+    <w:lvl w:ilvl="5" w:tentative="1">
+      <w:start w:val="1"/>
+      <w:numFmt w:val="bullet"/>
+      <w:lvlText w:val=""/>
+      <w:lvlJc w:val="left"/>
+      <w:pPr>
+        <w:tabs>
+          <w:tab w:val="num" w:pos="4320"/>
+        </w:tabs>
+        <w:ind w:left="4320" w:hanging="360"/>
+      </w:pPr>
+      <w:rPr>
+        <w:rFonts w:ascii="Wingdings" w:hAnsi="Wingdings" w:hint="default"/>
+        <w:sz w:val="20"/>
+      </w:rPr>
+    </w:lvl>
+    <w:lvl w:ilvl="6" w:tentative="1">
+      <w:start w:val="1"/>
+      <w:numFmt w:val="bullet"/>
+      <w:lvlText w:val=""/>
+      <w:lvlJc w:val="left"/>
+      <w:pPr>
+        <w:tabs>
+          <w:tab w:val="num" w:pos="5040"/>
+        </w:tabs>
+        <w:ind w:left="5040" w:hanging="360"/>
+      </w:pPr>
+      <w:rPr>
+        <w:rFonts w:ascii="Wingdings" w:hAnsi="Wingdings" w:hint="default"/>
+        <w:sz w:val="20"/>
+      </w:rPr>
+    </w:lvl>
+    <w:lvl w:ilvl="7" w:tentative="1">
+      <w:start w:val="1"/>
+      <w:numFmt w:val="bullet"/>
+      <w:lvlText w:val=""/>
+      <w:lvlJc w:val="left"/>
+      <w:pPr>
+        <w:tabs>
+          <w:tab w:val="num" w:pos="5760"/>
+        </w:tabs>
+        <w:ind w:left="5760" w:hanging="360"/>
+      </w:pPr>
+      <w:rPr>
+        <w:rFonts w:ascii="Wingdings" w:hAnsi="Wingdings" w:hint="default"/>
+        <w:sz w:val="20"/>
+      </w:rPr>
+    </w:lvl>
+    <w:lvl w:ilvl="8" w:tentative="1">
+      <w:start w:val="1"/>
+      <w:numFmt w:val="bullet"/>
+      <w:lvlText w:val=""/>
+      <w:lvlJc w:val="left"/>
+      <w:pPr>
+        <w:tabs>
+          <w:tab w:val="num" w:pos="6480"/>
+        </w:tabs>
+        <w:ind w:left="6480" w:hanging="360"/>
+      </w:pPr>
+      <w:rPr>
+        <w:rFonts w:ascii="Wingdings" w:hAnsi="Wingdings" w:hint="default"/>
+        <w:sz w:val="20"/>
+      </w:rPr>
+    </w:lvl>
+  </w:abstractNum>
+  <w:abstractNum w:abstractNumId="1" w15:restartNumberingAfterBreak="0">
+    <w:nsid w:val="3BAF6526"/>
+    <w:multiLevelType w:val="hybridMultilevel"/>
+    <w:tmpl w:val="55306404"/>
+    <w:lvl w:ilvl="0" w:tplc="40090001">
+      <w:start w:val="1"/>
+      <w:numFmt w:val="bullet"/>
+      <w:lvlText w:val=""/>
+      <w:lvlJc w:val="left"/>
+      <w:pPr>
+        <w:ind w:left="1440" w:hanging="360"/>
+      </w:pPr>
+      <w:rPr>
+        <w:rFonts w:ascii="Symbol" w:hAnsi="Symbol" w:hint="default"/>
+      </w:rPr>
+    </w:lvl>
+    <w:lvl w:ilvl="1" w:tplc="40090003" w:tentative="1">
+      <w:start w:val="1"/>
+      <w:numFmt w:val="bullet"/>
+      <w:lvlText w:val="o"/>
+      <w:lvlJc w:val="left"/>
+      <w:pPr>
+        <w:ind w:left="2160" w:hanging="360"/>
+      </w:pPr>
+      <w:rPr>
+        <w:rFonts w:ascii="Courier New" w:hAnsi="Courier New" w:cs="Courier New" w:hint="default"/>
+      </w:rPr>
+    </w:lvl>
+    <w:lvl w:ilvl="2" w:tplc="40090005" w:tentative="1">
+      <w:start w:val="1"/>
+      <w:numFmt w:val="bullet"/>
+      <w:lvlText w:val=""/>
+      <w:lvlJc w:val="left"/>
+      <w:pPr>
+        <w:ind w:left="2880" w:hanging="360"/>
+      </w:pPr>
+      <w:rPr>
+        <w:rFonts w:ascii="Wingdings" w:hAnsi="Wingdings" w:hint="default"/>
+      </w:rPr>
+    </w:lvl>
+    <w:lvl w:ilvl="3" w:tplc="40090001" w:tentative="1">
+      <w:start w:val="1"/>
+      <w:numFmt w:val="bullet"/>
+      <w:lvlText w:val=""/>
+      <w:lvlJc w:val="left"/>
+      <w:pPr>
+        <w:ind w:left="3600" w:hanging="360"/>
+      </w:pPr>
+      <w:rPr>
+        <w:rFonts w:ascii="Symbol" w:hAnsi="Symbol" w:hint="default"/>
+      </w:rPr>
+    </w:lvl>
+    <w:lvl w:ilvl="4" w:tplc="40090003" w:tentative="1">
+      <w:start w:val="1"/>
+      <w:numFmt w:val="bullet"/>
+      <w:lvlText w:val="o"/>
+      <w:lvlJc w:val="left"/>
+      <w:pPr>
+        <w:ind w:left="4320" w:hanging="360"/>
+      </w:pPr>
+      <w:rPr>
+        <w:rFonts w:ascii="Courier New" w:hAnsi="Courier New" w:cs="Courier New" w:hint="default"/>
+      </w:rPr>
+    </w:lvl>
+    <w:lvl w:ilvl="5" w:tplc="40090005" w:tentative="1">
+      <w:start w:val="1"/>
+      <w:numFmt w:val="bullet"/>
+      <w:lvlText w:val=""/>
+      <w:lvlJc w:val="left"/>
+      <w:pPr>
+        <w:ind w:left="5040" w:hanging="360"/>
+      </w:pPr>
+      <w:rPr>
+        <w:rFonts w:ascii="Wingdings" w:hAnsi="Wingdings" w:hint="default"/>
+      </w:rPr>
+    </w:lvl>
+    <w:lvl w:ilvl="6" w:tplc="40090001" w:tentative="1">
+      <w:start w:val="1"/>
+      <w:numFmt w:val="bullet"/>
+      <w:lvlText w:val=""/>
+      <w:lvlJc w:val="left"/>
+      <w:pPr>
+        <w:ind w:left="5760" w:hanging="360"/>
+      </w:pPr>
+      <w:rPr>
+        <w:rFonts w:ascii="Symbol" w:hAnsi="Symbol" w:hint="default"/>
+      </w:rPr>
+    </w:lvl>
+    <w:lvl w:ilvl="7" w:tplc="40090003" w:tentative="1">
+      <w:start w:val="1"/>
+      <w:numFmt w:val="bullet"/>
+      <w:lvlText w:val="o"/>
+      <w:lvlJc w:val="left"/>
+      <w:pPr>
+        <w:ind w:left="6480" w:hanging="360"/>
+      </w:pPr>
+      <w:rPr>
+        <w:rFonts w:ascii="Courier New" w:hAnsi="Courier New" w:cs="Courier New" w:hint="default"/>
+      </w:rPr>
+    </w:lvl>
+    <w:lvl w:ilvl="8" w:tplc="40090005" w:tentative="1">
+      <w:start w:val="1"/>
+      <w:numFmt w:val="bullet"/>
+      <w:lvlText w:val=""/>
+      <w:lvlJc w:val="left"/>
+      <w:pPr>
+        <w:ind w:left="7200" w:hanging="360"/>
+      </w:pPr>
+      <w:rPr>
+        <w:rFonts w:ascii="Wingdings" w:hAnsi="Wingdings" w:hint="default"/>
+      </w:rPr>
+    </w:lvl>
+  </w:abstractNum>
+  <w:abstractNum w:abstractNumId="2" w15:restartNumberingAfterBreak="0">
+    <w:nsid w:val="3F172112"/>
+    <w:multiLevelType w:val="multilevel"/>
+    <w:tmpl w:val="AD24F0C4"/>
+    <w:lvl w:ilvl="0">
+      <w:start w:val="1"/>
+      <w:numFmt w:val="bullet"/>
+      <w:lvlText w:val=""/>
+      <w:lvlJc w:val="left"/>
+      <w:pPr>
+        <w:tabs>
+          <w:tab w:val="num" w:pos="720"/>
+        </w:tabs>
+        <w:ind w:left="720" w:hanging="360"/>
+      </w:pPr>
+      <w:rPr>
+        <w:rFonts w:ascii="Symbol" w:hAnsi="Symbol" w:hint="default"/>
+        <w:sz w:val="20"/>
+      </w:rPr>
+    </w:lvl>
+    <w:lvl w:ilvl="1" w:tentative="1">
+      <w:start w:val="1"/>
+      <w:numFmt w:val="bullet"/>
+      <w:lvlText w:val="o"/>
+      <w:lvlJc w:val="left"/>
+      <w:pPr>
+        <w:tabs>
+          <w:tab w:val="num" w:pos="1440"/>
+        </w:tabs>
+        <w:ind w:left="1440" w:hanging="360"/>
+      </w:pPr>
+      <w:rPr>
+        <w:rFonts w:ascii="Courier New" w:hAnsi="Courier New" w:hint="default"/>
+        <w:sz w:val="20"/>
+      </w:rPr>
+    </w:lvl>
+    <w:lvl w:ilvl="2" w:tentative="1">
+      <w:start w:val="1"/>
+      <w:numFmt w:val="bullet"/>
+      <w:lvlText w:val=""/>
+      <w:lvlJc w:val="left"/>
+      <w:pPr>
+        <w:tabs>
+          <w:tab w:val="num" w:pos="2160"/>
+        </w:tabs>
+        <w:ind w:left="2160" w:hanging="360"/>
+      </w:pPr>
+      <w:rPr>
+        <w:rFonts w:ascii="Wingdings" w:hAnsi="Wingdings" w:hint="default"/>
+        <w:sz w:val="20"/>
+      </w:rPr>
+    </w:lvl>
+    <w:lvl w:ilvl="3" w:tentative="1">
+      <w:start w:val="1"/>
+      <w:numFmt w:val="bullet"/>
+      <w:lvlText w:val=""/>
+      <w:lvlJc w:val="left"/>
+      <w:pPr>
+        <w:tabs>
+          <w:tab w:val="num" w:pos="2880"/>
+        </w:tabs>
+        <w:ind w:left="2880" w:hanging="360"/>
+      </w:pPr>
+      <w:rPr>
+        <w:rFonts w:ascii="Wingdings" w:hAnsi="Wingdings" w:hint="default"/>
+        <w:sz w:val="20"/>
+      </w:rPr>
+    </w:lvl>
+    <w:lvl w:ilvl="4" w:tentative="1">
+      <w:start w:val="1"/>
+      <w:numFmt w:val="bullet"/>
+      <w:lvlText w:val=""/>
+      <w:lvlJc w:val="left"/>
+      <w:pPr>
+        <w:tabs>
+          <w:tab w:val="num" w:pos="3600"/>
+        </w:tabs>
+        <w:ind w:left="3600" w:hanging="360"/>
+      </w:pPr>
+      <w:rPr>
+        <w:rFonts w:ascii="Wingdings" w:hAnsi="Wingdings" w:hint="default"/>
+        <w:sz w:val="20"/>
+      </w:rPr>
+    </w:lvl>
+    <w:lvl w:ilvl="5" w:tentative="1">
+      <w:start w:val="1"/>
+      <w:numFmt w:val="bullet"/>
+      <w:lvlText w:val=""/>
+      <w:lvlJc w:val="left"/>
+      <w:pPr>
+        <w:tabs>
+          <w:tab w:val="num" w:pos="4320"/>
+        </w:tabs>
+        <w:ind w:left="4320" w:hanging="360"/>
+      </w:pPr>
+      <w:rPr>
+        <w:rFonts w:ascii="Wingdings" w:hAnsi="Wingdings" w:hint="default"/>
+        <w:sz w:val="20"/>
+      </w:rPr>
+    </w:lvl>
+    <w:lvl w:ilvl="6" w:tentative="1">
+      <w:start w:val="1"/>
+      <w:numFmt w:val="bullet"/>
+      <w:lvlText w:val=""/>
+      <w:lvlJc w:val="left"/>
+      <w:pPr>
+        <w:tabs>
+          <w:tab w:val="num" w:pos="5040"/>
+        </w:tabs>
+        <w:ind w:left="5040" w:hanging="360"/>
+      </w:pPr>
+      <w:rPr>
+        <w:rFonts w:ascii="Wingdings" w:hAnsi="Wingdings" w:hint="default"/>
+        <w:sz w:val="20"/>
+      </w:rPr>
+    </w:lvl>
+    <w:lvl w:ilvl="7" w:tentative="1">
+      <w:start w:val="1"/>
+      <w:numFmt w:val="bullet"/>
+      <w:lvlText w:val=""/>
+      <w:lvlJc w:val="left"/>
+      <w:pPr>
+        <w:tabs>
+          <w:tab w:val="num" w:pos="5760"/>
+        </w:tabs>
+        <w:ind w:left="5760" w:hanging="360"/>
+      </w:pPr>
+      <w:rPr>
+        <w:rFonts w:ascii="Wingdings" w:hAnsi="Wingdings" w:hint="default"/>
+        <w:sz w:val="20"/>
+      </w:rPr>
+    </w:lvl>
+    <w:lvl w:ilvl="8" w:tentative="1">
+      <w:start w:val="1"/>
+      <w:numFmt w:val="bullet"/>
+      <w:lvlText w:val=""/>
+      <w:lvlJc w:val="left"/>
+      <w:pPr>
+        <w:tabs>
+          <w:tab w:val="num" w:pos="6480"/>
+        </w:tabs>
+        <w:ind w:left="6480" w:hanging="360"/>
+      </w:pPr>
+      <w:rPr>
+        <w:rFonts w:ascii="Wingdings" w:hAnsi="Wingdings" w:hint="default"/>
+        <w:sz w:val="20"/>
+      </w:rPr>
+    </w:lvl>
+  </w:abstractNum>
+  <w:abstractNum w:abstractNumId="3" w15:restartNumberingAfterBreak="0">
+    <w:nsid w:val="4A3C221E"/>
+    <w:multiLevelType w:val="hybridMultilevel"/>
+    <w:tmpl w:val="3B6CEB94"/>
+    <w:lvl w:ilvl="0" w:tplc="40090001">
+      <w:start w:val="1"/>
+      <w:numFmt w:val="bullet"/>
+      <w:lvlText w:val=""/>
+      <w:lvlJc w:val="left"/>
+      <w:pPr>
+        <w:ind w:left="1440" w:hanging="360"/>
+      </w:pPr>
+      <w:rPr>
+        <w:rFonts w:ascii="Symbol" w:hAnsi="Symbol" w:hint="default"/>
+      </w:rPr>
+    </w:lvl>
+    <w:lvl w:ilvl="1" w:tplc="40090003" w:tentative="1">
+      <w:start w:val="1"/>
+      <w:numFmt w:val="bullet"/>
+      <w:lvlText w:val="o"/>
+      <w:lvlJc w:val="left"/>
+      <w:pPr>
+        <w:ind w:left="2160" w:hanging="360"/>
+      </w:pPr>
+      <w:rPr>
+        <w:rFonts w:ascii="Courier New" w:hAnsi="Courier New" w:cs="Courier New" w:hint="default"/>
+      </w:rPr>
+    </w:lvl>
+    <w:lvl w:ilvl="2" w:tplc="40090005" w:tentative="1">
+      <w:start w:val="1"/>
+      <w:numFmt w:val="bullet"/>
+      <w:lvlText w:val=""/>
+      <w:lvlJc w:val="left"/>
+      <w:pPr>
+        <w:ind w:left="2880" w:hanging="360"/>
+      </w:pPr>
+      <w:rPr>
+        <w:rFonts w:ascii="Wingdings" w:hAnsi="Wingdings" w:hint="default"/>
+      </w:rPr>
+    </w:lvl>
+    <w:lvl w:ilvl="3" w:tplc="40090001" w:tentative="1">
+      <w:start w:val="1"/>
+      <w:numFmt w:val="bullet"/>
+      <w:lvlText w:val=""/>
+      <w:lvlJc w:val="left"/>
+      <w:pPr>
+        <w:ind w:left="3600" w:hanging="360"/>
+      </w:pPr>
+      <w:rPr>
+        <w:rFonts w:ascii="Symbol" w:hAnsi="Symbol" w:hint="default"/>
+      </w:rPr>
+    </w:lvl>
+    <w:lvl w:ilvl="4" w:tplc="40090003" w:tentative="1">
+      <w:start w:val="1"/>
+      <w:numFmt w:val="bullet"/>
+      <w:lvlText w:val="o"/>
+      <w:lvlJc w:val="left"/>
+      <w:pPr>
+        <w:ind w:left="4320" w:hanging="360"/>
+      </w:pPr>
+      <w:rPr>
+        <w:rFonts w:ascii="Courier New" w:hAnsi="Courier New" w:cs="Courier New" w:hint="default"/>
+      </w:rPr>
+    </w:lvl>
+    <w:lvl w:ilvl="5" w:tplc="40090005" w:tentative="1">
+      <w:start w:val="1"/>
+      <w:numFmt w:val="bullet"/>
+      <w:lvlText w:val=""/>
+      <w:lvlJc w:val="left"/>
+      <w:pPr>
+        <w:ind w:left="5040" w:hanging="360"/>
+      </w:pPr>
+      <w:rPr>
+        <w:rFonts w:ascii="Wingdings" w:hAnsi="Wingdings" w:hint="default"/>
+      </w:rPr>
+    </w:lvl>
+    <w:lvl w:ilvl="6" w:tplc="40090001" w:tentative="1">
+      <w:start w:val="1"/>
+      <w:numFmt w:val="bullet"/>
+      <w:lvlText w:val=""/>
+      <w:lvlJc w:val="left"/>
+      <w:pPr>
+        <w:ind w:left="5760" w:hanging="360"/>
+      </w:pPr>
+      <w:rPr>
+        <w:rFonts w:ascii="Symbol" w:hAnsi="Symbol" w:hint="default"/>
+      </w:rPr>
+    </w:lvl>
+    <w:lvl w:ilvl="7" w:tplc="40090003" w:tentative="1">
+      <w:start w:val="1"/>
+      <w:numFmt w:val="bullet"/>
+      <w:lvlText w:val="o"/>
+      <w:lvlJc w:val="left"/>
+      <w:pPr>
+        <w:ind w:left="6480" w:hanging="360"/>
+      </w:pPr>
+      <w:rPr>
+        <w:rFonts w:ascii="Courier New" w:hAnsi="Courier New" w:cs="Courier New" w:hint="default"/>
+      </w:rPr>
+    </w:lvl>
+    <w:lvl w:ilvl="8" w:tplc="40090005" w:tentative="1">
+      <w:start w:val="1"/>
+      <w:numFmt w:val="bullet"/>
+      <w:lvlText w:val=""/>
+      <w:lvlJc w:val="left"/>
+      <w:pPr>
+        <w:ind w:left="7200" w:hanging="360"/>
+      </w:pPr>
+      <w:rPr>
+        <w:rFonts w:ascii="Wingdings" w:hAnsi="Wingdings" w:hint="default"/>
+      </w:rPr>
+    </w:lvl>
+  </w:abstractNum>
+  <w:abstractNum w:abstractNumId="4" w15:restartNumberingAfterBreak="0">
+    <w:nsid w:val="5D9318A9"/>
+    <w:multiLevelType w:val="multilevel"/>
+    <w:tmpl w:val="787811B6"/>
+    <w:lvl w:ilvl="0">
+      <w:start w:val="1"/>
+      <w:numFmt w:val="bullet"/>
+      <w:lvlText w:val=""/>
+      <w:lvlJc w:val="left"/>
+      <w:pPr>
+        <w:tabs>
+          <w:tab w:val="num" w:pos="720"/>
+        </w:tabs>
+        <w:ind w:left="720" w:hanging="360"/>
+      </w:pPr>
+      <w:rPr>
+        <w:rFonts w:ascii="Symbol" w:hAnsi="Symbol" w:hint="default"/>
+        <w:sz w:val="20"/>
+      </w:rPr>
+    </w:lvl>
+    <w:lvl w:ilvl="1" w:tentative="1">
+      <w:start w:val="1"/>
+      <w:numFmt w:val="bullet"/>
+      <w:lvlText w:val="o"/>
+      <w:lvlJc w:val="left"/>
+      <w:pPr>
+        <w:tabs>
+          <w:tab w:val="num" w:pos="1440"/>
+        </w:tabs>
+        <w:ind w:left="1440" w:hanging="360"/>
+      </w:pPr>
+      <w:rPr>
+        <w:rFonts w:ascii="Courier New" w:hAnsi="Courier New" w:hint="default"/>
+        <w:sz w:val="20"/>
+      </w:rPr>
+    </w:lvl>
+    <w:lvl w:ilvl="2" w:tentative="1">
+      <w:start w:val="1"/>
+      <w:numFmt w:val="bullet"/>
+      <w:lvlText w:val=""/>
+      <w:lvlJc w:val="left"/>
+      <w:pPr>
+        <w:tabs>
+          <w:tab w:val="num" w:pos="2160"/>
+        </w:tabs>
+        <w:ind w:left="2160" w:hanging="360"/>
+      </w:pPr>
+      <w:rPr>
+        <w:rFonts w:ascii="Wingdings" w:hAnsi="Wingdings" w:hint="default"/>
+        <w:sz w:val="20"/>
+      </w:rPr>
+    </w:lvl>
+    <w:lvl w:ilvl="3" w:tentative="1">
+      <w:start w:val="1"/>
+      <w:numFmt w:val="bullet"/>
+      <w:lvlText w:val=""/>
+      <w:lvlJc w:val="left"/>
+      <w:pPr>
+        <w:tabs>
+          <w:tab w:val="num" w:pos="2880"/>
+        </w:tabs>
+        <w:ind w:left="2880" w:hanging="360"/>
+      </w:pPr>
+      <w:rPr>
+        <w:rFonts w:ascii="Wingdings" w:hAnsi="Wingdings" w:hint="default"/>
+        <w:sz w:val="20"/>
+      </w:rPr>
+    </w:lvl>
+    <w:lvl w:ilvl="4" w:tentative="1">
+      <w:start w:val="1"/>
+      <w:numFmt w:val="bullet"/>
+      <w:lvlText w:val=""/>
+      <w:lvlJc w:val="left"/>
+      <w:pPr>
+        <w:tabs>
+          <w:tab w:val="num" w:pos="3600"/>
+        </w:tabs>
+        <w:ind w:left="3600" w:hanging="360"/>
+      </w:pPr>
+      <w:rPr>
+        <w:rFonts w:ascii="Wingdings" w:hAnsi="Wingdings" w:hint="default"/>
+        <w:sz w:val="20"/>
+      </w:rPr>
+    </w:lvl>
+    <w:lvl w:ilvl="5" w:tentative="1">
+      <w:start w:val="1"/>
+      <w:numFmt w:val="bullet"/>
+      <w:lvlText w:val=""/>
+      <w:lvlJc w:val="left"/>
+      <w:pPr>
+        <w:tabs>
+          <w:tab w:val="num" w:pos="4320"/>
+        </w:tabs>
+        <w:ind w:left="4320" w:hanging="360"/>
+      </w:pPr>
+      <w:rPr>
+        <w:rFonts w:ascii="Wingdings" w:hAnsi="Wingdings" w:hint="default"/>
+        <w:sz w:val="20"/>
+      </w:rPr>
+    </w:lvl>
+    <w:lvl w:ilvl="6" w:tentative="1">
+      <w:start w:val="1"/>
+      <w:numFmt w:val="bullet"/>
+      <w:lvlText w:val=""/>
+      <w:lvlJc w:val="left"/>
+      <w:pPr>
+        <w:tabs>
+          <w:tab w:val="num" w:pos="5040"/>
+        </w:tabs>
+        <w:ind w:left="5040" w:hanging="360"/>
+      </w:pPr>
+      <w:rPr>
+        <w:rFonts w:ascii="Wingdings" w:hAnsi="Wingdings" w:hint="default"/>
+        <w:sz w:val="20"/>
+      </w:rPr>
+    </w:lvl>
+    <w:lvl w:ilvl="7" w:tentative="1">
+      <w:start w:val="1"/>
+      <w:numFmt w:val="bullet"/>
+      <w:lvlText w:val=""/>
+      <w:lvlJc w:val="left"/>
+      <w:pPr>
+        <w:tabs>
+          <w:tab w:val="num" w:pos="5760"/>
+        </w:tabs>
+        <w:ind w:left="5760" w:hanging="360"/>
+      </w:pPr>
+      <w:rPr>
+        <w:rFonts w:ascii="Wingdings" w:hAnsi="Wingdings" w:hint="default"/>
+        <w:sz w:val="20"/>
+      </w:rPr>
+    </w:lvl>
+    <w:lvl w:ilvl="8" w:tentative="1">
+      <w:start w:val="1"/>
+      <w:numFmt w:val="bullet"/>
+      <w:lvlText w:val=""/>
+      <w:lvlJc w:val="left"/>
+      <w:pPr>
+        <w:tabs>
+          <w:tab w:val="num" w:pos="6480"/>
+        </w:tabs>
+        <w:ind w:left="6480" w:hanging="360"/>
+      </w:pPr>
+      <w:rPr>
+        <w:rFonts w:ascii="Wingdings" w:hAnsi="Wingdings" w:hint="default"/>
+        <w:sz w:val="20"/>
+      </w:rPr>
+    </w:lvl>
+  </w:abstractNum>
+  <w:abstractNum w:abstractNumId="5" w15:restartNumberingAfterBreak="0">
+    <w:nsid w:val="605270E5"/>
+    <w:multiLevelType w:val="multilevel"/>
+    <w:tmpl w:val="C88EA02C"/>
+    <w:lvl w:ilvl="0">
+      <w:start w:val="1"/>
+      <w:numFmt w:val="bullet"/>
+      <w:lvlText w:val=""/>
+      <w:lvlJc w:val="left"/>
+      <w:pPr>
+        <w:tabs>
+          <w:tab w:val="num" w:pos="720"/>
+        </w:tabs>
+        <w:ind w:left="720" w:hanging="360"/>
+      </w:pPr>
+      <w:rPr>
+        <w:rFonts w:ascii="Symbol" w:hAnsi="Symbol" w:hint="default"/>
+        <w:sz w:val="20"/>
+      </w:rPr>
+    </w:lvl>
+    <w:lvl w:ilvl="1" w:tentative="1">
+      <w:start w:val="1"/>
+      <w:numFmt w:val="bullet"/>
+      <w:lvlText w:val="o"/>
+      <w:lvlJc w:val="left"/>
+      <w:pPr>
+        <w:tabs>
+          <w:tab w:val="num" w:pos="1440"/>
+        </w:tabs>
+        <w:ind w:left="1440" w:hanging="360"/>
+      </w:pPr>
+      <w:rPr>
+        <w:rFonts w:ascii="Courier New" w:hAnsi="Courier New" w:hint="default"/>
+        <w:sz w:val="20"/>
+      </w:rPr>
+    </w:lvl>
+    <w:lvl w:ilvl="2" w:tentative="1">
+      <w:start w:val="1"/>
+      <w:numFmt w:val="bullet"/>
+      <w:lvlText w:val=""/>
+      <w:lvlJc w:val="left"/>
+      <w:pPr>
+        <w:tabs>
+          <w:tab w:val="num" w:pos="2160"/>
+        </w:tabs>
+        <w:ind w:left="2160" w:hanging="360"/>
+      </w:pPr>
+      <w:rPr>
+        <w:rFonts w:ascii="Wingdings" w:hAnsi="Wingdings" w:hint="default"/>
+        <w:sz w:val="20"/>
+      </w:rPr>
+    </w:lvl>
+    <w:lvl w:ilvl="3" w:tentative="1">
+      <w:start w:val="1"/>
+      <w:numFmt w:val="bullet"/>
+      <w:lvlText w:val=""/>
+      <w:lvlJc w:val="left"/>
+      <w:pPr>
+        <w:tabs>
+          <w:tab w:val="num" w:pos="2880"/>
+        </w:tabs>
+        <w:ind w:left="2880" w:hanging="360"/>
+      </w:pPr>
+      <w:rPr>
+        <w:rFonts w:ascii="Wingdings" w:hAnsi="Wingdings" w:hint="default"/>
+        <w:sz w:val="20"/>
+      </w:rPr>
+    </w:lvl>
+    <w:lvl w:ilvl="4" w:tentative="1">
+      <w:start w:val="1"/>
+      <w:numFmt w:val="bullet"/>
+      <w:lvlText w:val=""/>
+      <w:lvlJc w:val="left"/>
+      <w:pPr>
+        <w:tabs>
+          <w:tab w:val="num" w:pos="3600"/>
+        </w:tabs>
+        <w:ind w:left="3600" w:hanging="360"/>
+      </w:pPr>
+      <w:rPr>
+        <w:rFonts w:ascii="Wingdings" w:hAnsi="Wingdings" w:hint="default"/>
+        <w:sz w:val="20"/>
+      </w:rPr>
+    </w:lvl>
+    <w:lvl w:ilvl="5" w:tentative="1">
+      <w:start w:val="1"/>
+      <w:numFmt w:val="bullet"/>
+      <w:lvlText w:val=""/>
+      <w:lvlJc w:val="left"/>
+      <w:pPr>
+        <w:tabs>
+          <w:tab w:val="num" w:pos="4320"/>
+        </w:tabs>
+        <w:ind w:left="4320" w:hanging="360"/>
+      </w:pPr>
+      <w:rPr>
+        <w:rFonts w:ascii="Wingdings" w:hAnsi="Wingdings" w:hint="default"/>
+        <w:sz w:val="20"/>
+      </w:rPr>
+    </w:lvl>
+    <w:lvl w:ilvl="6" w:tentative="1">
+      <w:start w:val="1"/>
+      <w:numFmt w:val="bullet"/>
+      <w:lvlText w:val=""/>
+      <w:lvlJc w:val="left"/>
+      <w:pPr>
+        <w:tabs>
+          <w:tab w:val="num" w:pos="5040"/>
+        </w:tabs>
+        <w:ind w:left="5040" w:hanging="360"/>
+      </w:pPr>
+      <w:rPr>
+        <w:rFonts w:ascii="Wingdings" w:hAnsi="Wingdings" w:hint="default"/>
+        <w:sz w:val="20"/>
+      </w:rPr>
+    </w:lvl>
+    <w:lvl w:ilvl="7" w:tentative="1">
+      <w:start w:val="1"/>
+      <w:numFmt w:val="bullet"/>
+      <w:lvlText w:val=""/>
+      <w:lvlJc w:val="left"/>
+      <w:pPr>
+        <w:tabs>
+          <w:tab w:val="num" w:pos="5760"/>
+        </w:tabs>
+        <w:ind w:left="5760" w:hanging="360"/>
+      </w:pPr>
+      <w:rPr>
+        <w:rFonts w:ascii="Wingdings" w:hAnsi="Wingdings" w:hint="default"/>
+        <w:sz w:val="20"/>
+      </w:rPr>
+    </w:lvl>
+    <w:lvl w:ilvl="8" w:tentative="1">
+      <w:start w:val="1"/>
+      <w:numFmt w:val="bullet"/>
+      <w:lvlText w:val=""/>
+      <w:lvlJc w:val="left"/>
+      <w:pPr>
+        <w:tabs>
+          <w:tab w:val="num" w:pos="6480"/>
+        </w:tabs>
+        <w:ind w:left="6480" w:hanging="360"/>
+      </w:pPr>
+      <w:rPr>
+        <w:rFonts w:ascii="Wingdings" w:hAnsi="Wingdings" w:hint="default"/>
+        <w:sz w:val="20"/>
+      </w:rPr>
+    </w:lvl>
+  </w:abstractNum>
+  <w:num w:numId="1" w16cid:durableId="85729613">
+    <w:abstractNumId w:val="1"/>
+  </w:num>
+  <w:num w:numId="2" w16cid:durableId="630092502">
+    <w:abstractNumId w:val="3"/>
+  </w:num>
+  <w:num w:numId="3" w16cid:durableId="752893183">
+    <w:abstractNumId w:val="5"/>
+  </w:num>
+  <w:num w:numId="4" w16cid:durableId="670836771">
+    <w:abstractNumId w:val="2"/>
+  </w:num>
+  <w:num w:numId="5" w16cid:durableId="1681394567">
+    <w:abstractNumId w:val="0"/>
+  </w:num>
+  <w:num w:numId="6" w16cid:durableId="1590651363">
+    <w:abstractNumId w:val="4"/>
+  </w:num>
+</w:numbering>
 </file>
 
 <file path=word/styles.xml><?xml version="1.0" encoding="utf-8"?>
@@ -687,7 +1956,6 @@
   <w:style w:type="character" w:default="1" w:styleId="DefaultParagraphFont">
     <w:name w:val="Default Paragraph Font"/>
     <w:uiPriority w:val="1"/>
-    <w:semiHidden/>
     <w:unhideWhenUsed/>
   </w:style>
   <w:style w:type="table" w:default="1" w:styleId="TableNormal">

</xml_diff>